<commit_message>
Check the 2026 library's new positions in the eval
Adds 11 checks for positions the 2026 revision introduced, so a finding
that applies them matches the key instead of scoring as spurious. A spec
field can now be not_stated, meaning the clause is silent on the term. It
fails the check and is never drafted, so contracts written before a term
existed keep their drafts. eval-03 states every new term and stays the
compliant control; its ten affected clauses were redrafted.

The standards guard compares the library's content hash, since an admin
edit leaves the version string alone. eval-capture flattens parts with
contractText, as production does. The extraction golden changes because
the catalog gains ten terms.

Against the new key the model scores recall 88.7% and precision 81.4%
(was 93.1% and 74.2%).

Co-Authored-By: Claude Opus 5.5 <noreply@anthropic.com>
</commit_message>
<xml_diff>
--- a/data/sample-contracts/eval/eval-03-bayfront.docx
+++ b/data/sample-contracts/eval/eval-03-bayfront.docx
@@ -92,12 +92,12 @@
     </w:p>
     <w:p>
       <w:r>
-        <w:t xml:space="preserve">If Group cancels this agreement, Group shall pay liquidated damages calculated as a percentage of lost room profit based on the timing of cancellation notice relative to the event dates. Damages vary by how far before arrival the cancellation notice is given: cancellation more than twelve (12) months before arrival carries no liability, cancellation between six (6) and twelve (12) months before arrival is subject to fifty percent (50%) of damages, and cancellation within six (6) months of arrival is subject to one hundred percent (100%) of damages.</w:t>
-      </w:r>
-    </w:p>
-    <w:p>
-      <w:r>
-        <w:t xml:space="preserve">Revenue the Hotel earns reselling cancelled rooms is credited against what Group owes as liquidated damages. If Group books another event at the Hotel within a year, that revenue is credited against the damages paid for this cancellation. All damage calculations shall be itemized in writing and provided to Group within thirty (30) days of cancellation, and Group shall remit payment within forty-five (45) days of receiving the final invoice.</w:t>
+        <w:t xml:space="preserve">If Group cancels this Agreement, Group shall pay to Hotel cancellation damages calculated as a percentage of lost room profit based on the date notice of cancellation is received prior to the Event dates of June 2-5, 2027. Damages are assessed on a sliding scale: if notice is given twelve (12) months or more before June 2, 2027, damages equal zero percent of lost room profit; if notice is given between nine (9) and twelve (12) months before June 2, 2027, damages equal twenty-five (25) percent of lost room profit; if notice is given between six (6) and nine (9) months before June 2, 2027, damages equal fifty (50) percent of lost room profit; if notice is given between three (3) and six (6) months before June 2, 2027, damages equal seventy-five (75) percent of lost room profit; if notice is given fewer than three (3) months before June 2, 2027, damages equal one hundred (100) percent of lost room profit.</w:t>
+      </w:r>
+    </w:p>
+    <w:p>
+      <w:r>
+        <w:t xml:space="preserve">Room profit is calculated as seventy (70) percent of the single net group rate applied to the room block less allowable attrition. Any revenue Hotel earns reselling cancelled rooms is credited against Group's damage obligation. If Group books another event at Bayfront Harbor Hotel within twelve (12) months of the cancellation, the revenue generated by that rebooked event is credited against any cancellation damages Group owes from this cancellation. No liability shall accrue during the period of twelve (12) months prior to the Event dates for any failure by Group to meet the room block.</w:t>
       </w:r>
     </w:p>
     <w:tbl>
@@ -266,12 +266,12 @@
     </w:p>
     <w:p>
       <w:r>
-        <w:t xml:space="preserve">Upon receipt of any notice of room release or cancellation, the Hotel must actively try to resell released rooms and function space at rates equal to or greater than the Group rate. The Hotel shall market such space through its standard channels and shall make a good-faith effort to place released inventory with suitable alternative guests or groups within thirty (30) days of release.</w:t>
-      </w:r>
-    </w:p>
-    <w:p>
-      <w:r>
-        <w:t xml:space="preserve">Proceeds of any resale are credited against what Group owes in attrition charges or cancellation damages. The Hotel makes its resale records available to Group on request within fifteen (15) business days, including dates of release, rates offered, dates of resale, rates achieved, and any associated booking details. Group shall have thirty (30) days from receipt of resale records to dispute the Hotel's calculation of resale credits.</w:t>
+        <w:t xml:space="preserve">Upon release of any room inventory or function space by Group, Hotel shall undertake active and commercially reasonable efforts to resell the released space at the highest rates obtainable in the market. Any net proceeds derived from Hotel's resale of released inventory shall be credited dollar-for-dollar against Group's obligation to pay cancellation damages or any other sums due under this Agreement. Hotel shall maintain records of all resale activity undertaken in connection with released inventory and shall make those records available to Group upon written request within ten (10) business days of such request.</w:t>
+      </w:r>
+    </w:p>
+    <w:p>
+      <w:r>
+        <w:t xml:space="preserve">Cancellation damages shall become due and payable only after the Event dates of June 2-5, 2027 have passed, and then only upon Hotel's delivery to Group of documentation showing the resale efforts Hotel undertook and establishing the number of rooms and function space that remained unsold after Hotel's resale attempts. Group shall have ten (10) business days from receipt of such documentation to request clarification or contest Hotel's calculations. Payment shall be due within thirty (30) days of the final determination of damages.</w:t>
       </w:r>
     </w:p>
     <w:p>
@@ -302,12 +302,12 @@
     </w:p>
     <w:p>
       <w:r>
-        <w:t xml:space="preserve">A party may be excused from performance if the event becomes illegal, impossible or commercially impracticable due to circumstances beyond that party's reasonable control. Such circumstances include government-imposed travel restrictions and advisories, epidemics and pandemics, and conditions making it unsafe or imprudent for attendees to travel or gather. The excused party must provide prompt written notice to the other party with supporting documentation of the force majeure event.</w:t>
-      </w:r>
-    </w:p>
-    <w:p>
-      <w:r>
-        <w:t xml:space="preserve">Deposits are refunded promptly when this agreement ends for force majeure, within thirty (30) days of the Hotel's receipt and verification of the force majeure claim. If Group elects to reschedule rather than cancel, deposits shall be credited toward the rescheduled event without penalty. This clause does not excuse payment for services already rendered prior to the force majeure event.</w:t>
+        <w:t xml:space="preserve">Neither party shall be liable to the other for any failure to perform its obligations under this Agreement when performance becomes illegal, impossible or commercially impracticable due to an event or circumstance beyond that party's reasonable control. Force majeure events include, without limitation, government-imposed travel restrictions and official travel advisories that restrict or discourage travel to Portland, Oregon, epidemics and pandemics affecting public health or travel, and conditions of public safety, health, or infrastructure that render it unsafe or imprudent for Group's attendees to travel to or gather at the Hotel or in Portland.</w:t>
+      </w:r>
+    </w:p>
+    <w:p>
+      <w:r>
+        <w:t xml:space="preserve">If this Agreement is cancelled or terminated due to a force majeure event, Group's deposits shall be refunded to Group in full within thirty (30) days of the cancellation or termination. Group may cancel this Agreement for force majeure if the event causes or Group reasonably expects it will cause twenty (20) percent or more of the anticipated attendees to cancel their attendance at the Event. Cancellation for force majeure requires written notice to Hotel stating the specific force majeure event and the basis for Group's belief that the threshold of cancellations has been or will be met.</w:t>
       </w:r>
     </w:p>
     <w:p>
@@ -338,12 +338,12 @@
     </w:p>
     <w:p>
       <w:r>
-        <w:t xml:space="preserve">If the Hotel terminates this agreement for cause, the Group incurs no liability under this agreement and shall receive a prompt refund of all deposits paid to the Hotel. Cause means a material breach by Group that remains uncured for ten (10) days after written notice from the Hotel specifying the breach in detail.</w:t>
-      </w:r>
-    </w:p>
-    <w:p>
-      <w:r>
-        <w:t xml:space="preserve">Termination for cause is distinct from the cancellation damages provided elsewhere in this agreement and does not invoke the cancellation scale. The Group's sole remedy upon termination for cause is the return of its deposits. No party shall assert a claim under the cancellation clause if the other party has terminated for cause.</w:t>
+        <w:t xml:space="preserve">Group may terminate this Agreement on account of cause without liability to Hotel, provided that Hotel shall promptly refund all deposits paid by Group. Cause for purposes of this clause means that Group has made a good-faith determination that an epidemic or pandemic is materially affecting its ability to hold the Event as intended and that continuation of this Agreement is no longer feasible.</w:t>
+      </w:r>
+    </w:p>
+    <w:p>
+      <w:r>
+        <w:t xml:space="preserve">Termination under this clause is separate from and does not invoke the cancellation damages schedule set forth elsewhere in this Agreement. Group's right to terminate for cause and the remedies flowing from such termination shall be governed solely by the terms of this clause.</w:t>
       </w:r>
     </w:p>
     <w:p>
@@ -428,12 +428,12 @@
     </w:p>
     <w:p>
       <w:r>
-        <w:t xml:space="preserve">The Hotel honors all audio-visual and internet pricing as quoted to Group at the time of contracting. Any audio-visual services or internet connectivity requested after the execution of this Agreement shall be provided at a discount to the Hotel's then-current standard rates.</w:t>
-      </w:r>
-    </w:p>
-    <w:p>
-      <w:r>
-        <w:t xml:space="preserve">The use of the Hotel's in-house audio-visual provider is not a condition to the availability or pricing of any complimentary service, discounted rate, or other benefit provided under this Agreement. Group may engage a third-party audio-visual vendor at Group's expense without affecting Group's entitlement to any such service or benefit.</w:t>
+        <w:t xml:space="preserve">Hotel shall honor all audio-visual and internet pricing quoted to Group at the time of contracting, and any audio-visual or internet services added to this Agreement after contracting shall be provided at a discounted rate to be negotiated in good faith. The pricing quoted at contracting constitutes the baseline rate for all services identified in the proposal provided to Group.</w:t>
+      </w:r>
+    </w:p>
+    <w:p>
+      <w:r>
+        <w:t xml:space="preserve">Use of Hotel's in-house audio-visual provider shall not be a condition precedent to Group's entitlement to any complimentary services or discounted room rates negotiated under this Agreement. The internet service provided shall guarantee a minimum bandwidth of 10 Mbps download and 1 Mbps upload during all hours of the Event.</w:t>
       </w:r>
     </w:p>
     <w:p>
@@ -464,12 +464,12 @@
     </w:p>
     <w:p>
       <w:r>
-        <w:t xml:space="preserve">The Hotel shall provide complimentary rooms to Group at a ratio of one (1) complimentary room for every forty (40) paid room nights booked and occupied. This complimentary room credit accrues automatically as paid room nights are occupied during the event dates. Group is entitled to apply complimentary room credit to any rooms reserved under this agreement, and the Hotel shall honor the credit without requiring advance notice or separate application.</w:t>
-      </w:r>
-    </w:p>
-    <w:p>
-      <w:r>
-        <w:t xml:space="preserve">Complimentary room credit earned by Group prior to the end of the event dates shall not be forfeited or reduced due to any shortfall in room pickup or any attrition charge assessed under this agreement. Earned comp credit remains the property of Group and shall be available for use on any rooms occupied on or before the final event date.</w:t>
+        <w:t xml:space="preserve">For every forty (40) room nights picked up and paid for by Group, Group shall receive one (1) complimentary room night to be used during the Event. The complimentary room ratio accrues automatically as room nights are paid and charged, and Group is entitled to such complimentary rooms without further qualification or approval. Hotel shall track and calculate the number of complimentary rooms earned based on actual paid pickup appearing on Group's billing records.</w:t>
+      </w:r>
+    </w:p>
+    <w:p>
+      <w:r>
+        <w:t xml:space="preserve">Complimentary room credit that Group has already earned shall not be forfeited or reduced as a result of any shortfall between Group's original room commitment and actual pickup at the hotel. Each room night for which Group is charged a no-show or cancellation fee shall be credited toward Group's total room-night pickup for purposes of both attrition calculations and the complimentary room ratio.</w:t>
       </w:r>
     </w:p>
     <w:p>
@@ -482,12 +482,12 @@
     </w:p>
     <w:p>
       <w:r>
-        <w:t xml:space="preserve">The Hotel shall not offer to the general public any room rate lower than the rate extended to Group under this agreement for rooms occupied during the event dates of June 2-5, 2027. This rate parity obligation applies to all public distribution channels, including the Hotel's own website, third-party booking sites, and any other source of public availability. If the Hotel becomes aware of a public rate below Group's rate, the Hotel shall immediately notify Group in writing.</w:t>
-      </w:r>
-    </w:p>
-    <w:p>
-      <w:r>
-        <w:t xml:space="preserve">If a lower public rate is offered or identified during the event dates, Group's rate shall be retroactively adjusted to match the lower public rate, effective as of the date the lower rate was first offered. This retroactive adjustment shall apply to all rooms reserved by Group, including reservations made prior to the discovery of the lower rate. Commission and room pickup credit shall remain unaffected by any rate adjustment and shall be recalculated on the adjusted rate to Group's benefit.</w:t>
+        <w:t xml:space="preserve">The Hotel shall not offer any member of the general public a rate lower than the rate offered to Group during the Event dates of June 2-5, 2027. In the event that the Hotel makes available to the general public a rate lower than Group's rate during this period, Group's rate shall be automatically adjusted downward to match the lower public rate, effective retroactively to the date the lower rate was first offered, and this adjustment shall apply to all reservations made by Group members, whether prior to or after the rate reduction. The Hotel shall provide written notice of any such adjustment within two (2) business days of the reduction becoming available. Group's rate shall in no case exceed the rate offered to any other group booking the Hotel during the seven (7) day period preceding the Event or the seven (7) day period following the Event.</w:t>
+      </w:r>
+    </w:p>
+    <w:p>
+      <w:r>
+        <w:t xml:space="preserve">Notwithstanding any rate adjustment under this clause, Group's contracted commission and all pickup credits shall remain unchanged and unaffected by any retroactive or prospective modification to Group's room rate. The Hotel shall continue to credit Group's master account with commission based on the originally contracted percentage of room revenue, computed on adjusted rates if applicable, and all nights stayed by Group members shall continue to count toward Group's room pickup guarantee without diminution or recalculation.</w:t>
       </w:r>
     </w:p>
     <w:p>
@@ -572,12 +572,12 @@
     </w:p>
     <w:p>
       <w:r>
-        <w:t xml:space="preserve">If the Hotel becomes unable to provide a guaranteed reservation due to overbooking or other circumstances beyond the Hotel's control, the Hotel shall relocate the affected guest to a comparable or better hotel at the Hotel's expense. The Hotel shall arrange and pay for round-trip transportation between the alternative hotel and the event venue for each relocated guest. Upon return to the Hotel, the relocated guest shall be provided with an upgraded room category and a welcome amenity at no additional cost to the guest.</w:t>
-      </w:r>
-    </w:p>
-    <w:p>
-      <w:r>
-        <w:t xml:space="preserve">Notwithstanding relocation to an alternative property, each night spent at the relocated hotel shall be credited toward the Group's room pickup total and shall count toward commission calculations as if the night had been fulfilled at the Hotel. The Group shall receive written notice of any relocation within twenty-four (24) hours of the Hotel's determination that relocation is necessary, which notice shall include the name and location of the alternative hotel and the date and time of the arranged transportation.</w:t>
+        <w:t xml:space="preserve">In the event the Hotel is unable to honor any guaranteed reservation due to overbooking or unavailability, the Hotel shall relocate the affected guest to a comparable or better hotel selected by the Hotel, all relocation expenses to be borne solely by the Hotel. The Hotel shall arrange and pay for round-trip transportation between the alternative accommodation and the venue of the Event for the affected guest. Upon the guest's return to the Bayfront Harbor Hotel, the Hotel shall place the guest in an upgraded room category at no additional charge to the guest and shall provide a welcome amenity of reasonable value as determined by the Hotel's management.</w:t>
+      </w:r>
+    </w:p>
+    <w:p>
+      <w:r>
+        <w:t xml:space="preserve">Each night a guest is relocated to alternative accommodation shall be fully credited toward Group's room pickup guarantee and shall not reduce the number of nights counted for commission calculation purposes. The Hotel shall credit Group's master account in the amount of $100.00 per night of relocation as compensation for the inconvenience and administrative burden imposed by the relocation. Such credits shall appear on Group's master folio statement within seven (7) business days of the relocation and shall be applied against any balance owed by Group.</w:t>
       </w:r>
     </w:p>
     <w:p>
@@ -680,12 +680,12 @@
     </w:p>
     <w:p>
       <w:r>
-        <w:t xml:space="preserve">The Hotel and Group shall indemnify and hold harmless each other from all claims, damages, losses and liabilities arising out of or connected to the event, and each party's obligation to indemnify the other shall operate on identical terms and conditions. This mutual indemnification shall extend to the indemnified party's officers, directors, employees and agents, and each party shall be responsible for defending the other against claims covered by its indemnity.</w:t>
-      </w:r>
-    </w:p>
-    <w:p>
-      <w:r>
-        <w:t xml:space="preserve">Notwithstanding the foregoing, each party's obligation to indemnify the other shall be limited to claims arising solely from that party's own negligence or willful misconduct. Group shall maintain general liability insurance with minimum limits of $1,000,000.00, and Group shall provide the Hotel with a certificate of insurance evidencing such coverage prior to the event.</w:t>
+        <w:t xml:space="preserve">Each party shall indemnify, defend, and hold harmless the other party from and against all claims, damages, liabilities, and expenses arising out of or resulting from that party's own negligence or willful misconduct in connection with this Agreement and the Event. The indemnification obligations shall be mutual and equal in scope, with each party responsible for defending itself and the other party against claims arising from its own acts or omissions. The indemnifying party shall promptly notify the indemnified party of any claim and shall have the right to control the defense of such claim, provided that no settlement shall be made without the indemnified party's prior written consent.</w:t>
+      </w:r>
+    </w:p>
+    <w:p>
+      <w:r>
+        <w:t xml:space="preserve">Group shall maintain a policy of general liability insurance covering bodily injury, property damage, and personal injury with minimum limits of $1,000,000.00 per occurrence and $2,000,000.00 in the aggregate, naming the Hotel as an additional insured. The Hotel shall maintain adequate insurance coverage to protect its own operations and activities during the Event. Each party shall provide the other with certificates of insurance evidencing the required coverage at least fourteen (14) days prior to the Event dates, and such coverage shall remain in force throughout the duration of the Event and for thirty (30) days thereafter.</w:t>
       </w:r>
     </w:p>
     <w:p>
@@ -752,12 +752,12 @@
     </w:p>
     <w:p>
       <w:r>
-        <w:t xml:space="preserve">Beginning four (4) weeks prior to the event and continuing through the room cutoff date, the Hotel shall provide Group with a written pickup report each week in the run-up to cutoff detailing the number of rooms reserved, released and cancelled, together with updated projections of Group's final room block commitment. Each report shall be delivered to Group's primary contact by email on the same business day each week, and shall include all modifications made since the prior week's report.</w:t>
-      </w:r>
-    </w:p>
-    <w:p>
-      <w:r>
-        <w:t xml:space="preserve">Within thirty (30) days following the conclusion of the event, the Hotel shall provide Group with a comprehensive post-event report containing final room charges, incidental revenue by category and a detailed reconciliation against the final billing invoice. Group may audit the room block at no cost to itself, and may request supporting documentation including daily rooming records and charge details within sixty (60) days of receiving the post-event report. The Hotel shall make such documentation available for Group's review within ten (10) business days of any such request.</w:t>
+        <w:t xml:space="preserve">The Hotel shall provide the Group with a written pickup report on a weekly basis during the period preceding the cutoff date. This report will show the number of rooms reserved under the block and such other information as the Hotel customarily reports to groups at this stage. The Group may request clarification of any figures in the report, and the Hotel will respond within two (2) business days.</w:t>
+      </w:r>
+    </w:p>
+    <w:p>
+      <w:r>
+        <w:t xml:space="preserve">Within thirty (30) days after the conclusion of the Event, the Hotel shall deliver to the Group a final reconciliation report setting forth all room nights sold, rates applied, and revenue generated. The Group shall have the right to audit the room block at its own expense or, if it elects to conduct the audit itself, at no cost to the Group. The Group may challenge figures in the final report within ten (10) days of receipt; after that period, the report shall be deemed accepted. The parties acknowledge that the room block shall be subject to written review at the following dates: July 1, 2026, October 1, 2026, and February 1, 2027, and at each such review date the Group may increase or decrease the block by no more than fifteen percent (15%) of the then-current commitment.</w:t>
       </w:r>
     </w:p>
     <w:p>

</xml_diff>